<commit_message>
Core 2: plan first, draft vs. refine, and Zoom delivery
- Plan before any AI draft: a few bullets in your own words
- New guidance on when an AI draft is OK (routine, low stakes) versus
  writing it yourself and using AI to refine (expertise, high stakes)
- AI as an editor: refine language, catch inconsistencies, find what's
  missing, as a list rather than a rewrite
- Job A now finds gaps; Job B drafts a reply from your outline
- All in-person cues replaced with Zoom ones (chat, reactions, shared
  screen); instructor guide rewritten for virtual delivery
- HTML slides (21), PowerPoint, page, guide, and demo files updated

Co-Authored-By: Claude Opus 5.5 <noreply@anthropic.com>
</commit_message>
<xml_diff>
--- a/demo-materials/Workshop2_Demo_StudyDescription.docx
+++ b/demo-materials/Workshop2_Demo_StudyDescription.docx
@@ -101,7 +101,7 @@
         <w:spacing w:after="100"/>
       </w:pPr>
       <w:r>
-        <w:t xml:space="preserve">Draft a short “Next Steps” section: one paragraph, three concrete steps, active voice.</w:t>
+        <w:t xml:space="preserve">What would a funder expect in a study description that isn't here? List the gaps; don't rewrite.</w:t>
       </w:r>
     </w:p>
     <w:p>
@@ -116,7 +116,7 @@
           <w:sz w:val="20"/>
           <w:szCs w:val="20"/>
         </w:rPr>
-        <w:t xml:space="preserve">Verify step: does the lay version keep the facts accurate? Did anything get invented?</w:t>
+        <w:t xml:space="preserve">Check: did the plain version keep the facts right? Are the gaps it lists real ones?</w:t>
       </w:r>
     </w:p>
     <w:sectPr>

</xml_diff>